<commit_message>
﻿Train sentiment on RoBERTa teacher labels instead of star ratings.
Adds teacher labeling script, updates eval/docs/UI for text-only labels, and records new holdout metrics.
</commit_message>
<xml_diff>
--- a/docs/Feedback_Review_Analyzer_Backend_Guide.docx
+++ b/docs/Feedback_Review_Analyzer_Backend_Guide.docx
@@ -708,7 +708,7 @@
         <w:pStyle w:val="ListNumber"/>
       </w:pPr>
       <w:r>
-        <w:t>Drift — sentiment/theme PSI, volume change, review-length KS; weekly series.</w:t>
+        <w:t>Drift — sentiment/theme PSI, volume change, review-length KS; weekly series (see §4.4 Drift formulas). Stubbed when dates_available is false.</w:t>
       </w:r>
     </w:p>
     <w:p>
@@ -1147,7 +1147,76 @@
         <w:pStyle w:val="Heading2"/>
       </w:pPr>
       <w:r>
-        <w:t>4.3 Complaint Radar rules (general, not dataset-specific)</w:t>
+        <w:t>4.3 Complaint Radar formulas (ml/complaints/radar.py)</w:t>
+      </w:r>
+    </w:p>
+    <w:p>
+      <w:r>
+        <w:t>Windows (default window_days = 14), ending at the latest review timestamp:</w:t>
+      </w:r>
+    </w:p>
+    <w:p>
+      <w:pPr>
+        <w:shd w:fill="F3F4F6" w:val="clear"/>
+      </w:pPr>
+      <w:r>
+        <w:rPr>
+          <w:rFonts w:ascii="Consolas" w:hAnsi="Consolas"/>
+          <w:sz w:val="18"/>
+        </w:rPr>
+        <w:t>current  = (end - 14d, end]</w:t>
+        <w:br/>
+        <w:t>previous = (end - 28d, end - 14d]</w:t>
+      </w:r>
+    </w:p>
+    <w:p>
+      <w:r>
+        <w:t>Core quantities:</w:t>
+      </w:r>
+    </w:p>
+    <w:p>
+      <w:pPr>
+        <w:shd w:fill="F3F4F6" w:val="clear"/>
+      </w:pPr>
+      <w:r>
+        <w:rPr>
+          <w:rFonts w:ascii="Consolas" w:hAnsi="Consolas"/>
+          <w:sz w:val="18"/>
+        </w:rPr>
+        <w:t>growth_pct     = (current - previous) / previous * 100     # None if previous == 0</w:t>
+        <w:br/>
+        <w:t>negative_ratio = (# negative reviews of theme in current) / (# theme reviews in current)</w:t>
+        <w:br/>
+        <w:t>acceleration_pp = ((c-b)/b - (b-a)/a) * 100               # last three weekly buckets a,b,c</w:t>
+      </w:r>
+    </w:p>
+    <w:p>
+      <w:r>
+        <w:t>Weekly trend: linear regression slope on weekly counts; relative = slope / mean(counts). rising if rel &gt; 0.05, falling if rel &lt; -0.05, else stable.</w:t>
+      </w:r>
+    </w:p>
+    <w:p>
+      <w:r>
+        <w:t>Min current mentions scales with batch size:</w:t>
+      </w:r>
+    </w:p>
+    <w:p>
+      <w:pPr>
+        <w:shd w:fill="F3F4F6" w:val="clear"/>
+      </w:pPr>
+      <w:r>
+        <w:rPr>
+          <w:rFonts w:ascii="Consolas" w:hAnsi="Consolas"/>
+          <w:sz w:val="18"/>
+        </w:rPr>
+        <w:t>if n_reviews &gt;= 5000: min_mentions = 30</w:t>
+        <w:br/>
+        <w:t>else: min_mentions = clamp(round(n_reviews * 0.015), floor=8, ceil=30)</w:t>
+      </w:r>
+    </w:p>
+    <w:p>
+      <w:r>
+        <w:t>Status rules (evaluated in order):</w:t>
       </w:r>
     </w:p>
     <w:p>
@@ -1155,7 +1224,7 @@
         <w:pStyle w:val="ListBullet"/>
       </w:pPr>
       <w:r>
-        <w:t>Windows: current = last window_days (default 14); previous = the 14 days before that.</w:t>
+        <w:t>NO_DATA — current == 0 and previous == 0</w:t>
       </w:r>
     </w:p>
     <w:p>
@@ -1163,7 +1232,7 @@
         <w:pStyle w:val="ListBullet"/>
       </w:pPr>
       <w:r>
-        <w:t>NEW — previous==0 and current ≥ effective min mentions.</w:t>
+        <w:t>NOT_A_COMPLAINT — negative_ratio &lt; 0.50 (current, or whole batch if current empty)</w:t>
       </w:r>
     </w:p>
     <w:p>
@@ -1171,7 +1240,7 @@
         <w:pStyle w:val="ListBullet"/>
       </w:pPr>
       <w:r>
-        <w:t>EMERGING — growth_pct ≥ +50%.</w:t>
+        <w:t>INSUFFICIENT_EVIDENCE — current &lt; min_mentions, or negative evidence reviews &lt; 3</w:t>
       </w:r>
     </w:p>
     <w:p>
@@ -1179,7 +1248,7 @@
         <w:pStyle w:val="ListBullet"/>
       </w:pPr>
       <w:r>
-        <w:t>DECLINING — growth_pct ≤ −25%, OR growth ≤ −15% with a falling multi-week trend (soft decline).</w:t>
+        <w:t>NEW — previous == 0 and current &gt;= min_mentions</w:t>
       </w:r>
     </w:p>
     <w:p>
@@ -1187,7 +1256,7 @@
         <w:pStyle w:val="ListBullet"/>
       </w:pPr>
       <w:r>
-        <w:t>STABLE — otherwise (after complaint / evidence gates).</w:t>
+        <w:t>EMERGING — growth_pct &gt;= 50</w:t>
       </w:r>
     </w:p>
     <w:p>
@@ -1195,7 +1264,7 @@
         <w:pStyle w:val="ListBullet"/>
       </w:pPr>
       <w:r>
-        <w:t>NOT_A_COMPLAINT — negative ratio below 50%.</w:t>
+        <w:t>DECLINING — growth_pct &lt;= -25, OR (growth_pct &lt;= -15 AND weekly trend is falling AND previous &gt;= min_mentions)</w:t>
       </w:r>
     </w:p>
     <w:p>
@@ -1203,23 +1272,49 @@
         <w:pStyle w:val="ListBullet"/>
       </w:pPr>
       <w:r>
-        <w:t>INSUFFICIENT_EVIDENCE — too few current mentions or negative evidence rows, or batch shorter than two windows.</w:t>
+        <w:t>STABLE — otherwise</w:t>
+      </w:r>
+    </w:p>
+    <w:p>
+      <w:r>
+        <w:t>Priority (sort key only; does not decide status), max_growth_bonus = 3:</w:t>
       </w:r>
     </w:p>
     <w:p>
       <w:pPr>
-        <w:pStyle w:val="ListBullet"/>
+        <w:shd w:fill="F3F4F6" w:val="clear"/>
       </w:pPr>
       <w:r>
-        <w:t>Min mentions scale down on small CSVs (&lt;5000 rows) so tiny uploads are not stuck forever.</w:t>
+        <w:rPr>
+          <w:rFonts w:ascii="Consolas" w:hAnsi="Consolas"/>
+          <w:sz w:val="18"/>
+        </w:rPr>
+        <w:t>growth_factor = 1 + clip(growth_pct / 100, 0, 3)     # NEW: growth_factor = 1 + 3 = 4</w:t>
+        <w:br/>
+        <w:t>priority      = current_negative_mentions * growth_factor</w:t>
+      </w:r>
+    </w:p>
+    <w:p>
+      <w:r>
+        <w:t>Segment association lift (app_version / platform), association not causation:</w:t>
       </w:r>
     </w:p>
     <w:p>
       <w:pPr>
-        <w:pStyle w:val="ListBullet"/>
+        <w:shd w:fill="F3F4F6" w:val="clear"/>
       </w:pPr>
       <w:r>
-        <w:t>Priority = current_negative_mentions × (1 + clip(growth/100, 0, 3)); NEW uses ×4.</w:t>
+        <w:rPr>
+          <w:rFonts w:ascii="Consolas" w:hAnsi="Consolas"/>
+          <w:sz w:val="18"/>
+        </w:rPr>
+        <w:t>theme_share   = count(segment=v in theme current) / count(theme current with segment)</w:t>
+        <w:br/>
+        <w:t>overall_share = count(segment=v in all current) / count(all current with segment)</w:t>
+        <w:br/>
+        <w:t>lift          = theme_share / overall_share</w:t>
+        <w:br/>
+        <w:t># keep if support &gt;= 20 and lift &gt;= 1.3</w:t>
       </w:r>
     </w:p>
     <w:p>
@@ -1227,12 +1322,47 @@
         <w:pStyle w:val="Heading2"/>
       </w:pPr>
       <w:r>
-        <w:t>4.4 Per-DB evaluation (batch_eval)</w:t>
+        <w:t>4.4 Drift formulas (ml/drift/monitor.py)</w:t>
       </w:r>
     </w:p>
     <w:p>
       <w:r>
-        <w:t>Stored under reports keys sentiment_validation and batch_evaluation:</w:t>
+        <w:t>Drift compares a reference window vs a current window (usually two consecutive 14-day periods from the batch’s own timestamps). Implementation: ml/drift/monitor.py. Served by GET /drift. When the upload has no usable dates, the pipeline writes a stub with status unavailable.</w:t>
+      </w:r>
+    </w:p>
+    <w:p>
+      <w:r>
+        <w:t>Four metrics are computed; overall_status is the worst of the four (none &lt; moderate &lt; significant).</w:t>
+      </w:r>
+    </w:p>
+    <w:p>
+      <w:pPr>
+        <w:pStyle w:val="Heading3"/>
+      </w:pPr>
+      <w:r>
+        <w:t>Sentiment and theme mix — Population Stability Index (PSI)</w:t>
+      </w:r>
+    </w:p>
+    <w:p>
+      <w:r>
+        <w:t>Convert each window to category shares (sentiment: negative / neutral / positive; themes: theme_id plus unassigned). Clip each share with epsilon ε = 1e-4, renormalize, then:</w:t>
+      </w:r>
+    </w:p>
+    <w:p>
+      <w:pPr>
+        <w:shd w:fill="F3F4F6" w:val="clear"/>
+      </w:pPr>
+      <w:r>
+        <w:rPr>
+          <w:rFonts w:ascii="Consolas" w:hAnsi="Consolas"/>
+          <w:sz w:val="18"/>
+        </w:rPr>
+        <w:t>PSI = sum_i (p_cur_i - p_ref_i) * ln(p_cur_i / p_ref_i)</w:t>
+      </w:r>
+    </w:p>
+    <w:p>
+      <w:r>
+        <w:t>Jensen–Shannon distance (base 2) is also stored as a bounded [0, 1] companion (js_distance).</w:t>
       </w:r>
     </w:p>
     <w:tbl>
@@ -1242,47 +1372,33 @@
         <w:tblLook w:firstColumn="1" w:firstRow="1" w:lastColumn="0" w:lastRow="0" w:noHBand="0" w:noVBand="1" w:val="04A0"/>
       </w:tblPr>
       <w:tblGrid>
-        <w:gridCol w:w="3168"/>
-        <w:gridCol w:w="3168"/>
-        <w:gridCol w:w="3168"/>
+        <w:gridCol w:w="4752"/>
+        <w:gridCol w:w="4752"/>
       </w:tblGrid>
       <w:tr>
         <w:tc>
           <w:tcPr>
-            <w:tcW w:type="dxa" w:w="3168"/>
+            <w:tcW w:type="dxa" w:w="4752"/>
           </w:tcPr>
           <w:p>
             <w:r>
               <w:rPr>
                 <w:b/>
               </w:rPr>
-              <w:t>Score</w:t>
+              <w:t>PSI value</w:t>
             </w:r>
           </w:p>
         </w:tc>
         <w:tc>
           <w:tcPr>
-            <w:tcW w:type="dxa" w:w="3168"/>
+            <w:tcW w:type="dxa" w:w="4752"/>
           </w:tcPr>
           <w:p>
             <w:r>
               <w:rPr>
                 <w:b/>
               </w:rPr>
-              <w:t>When available</w:t>
-            </w:r>
-          </w:p>
-        </w:tc>
-        <w:tc>
-          <w:tcPr>
-            <w:tcW w:type="dxa" w:w="3168"/>
-          </w:tcPr>
-          <w:p>
-            <w:r>
-              <w:rPr>
-                <w:b/>
-              </w:rPr>
-              <w:t>Meaning</w:t>
+              <w:t>Status</w:t>
             </w:r>
           </w:p>
         </w:tc>
@@ -1290,31 +1406,21 @@
       <w:tr>
         <w:tc>
           <w:tcPr>
-            <w:tcW w:type="dxa" w:w="3168"/>
+            <w:tcW w:type="dxa" w:w="4752"/>
           </w:tcPr>
           <w:p>
             <w:r>
-              <w:t>Sentiment 3-class accuracy + macro recall</w:t>
+              <w:t>&lt; 0.10</w:t>
             </w:r>
           </w:p>
         </w:tc>
         <w:tc>
           <w:tcPr>
-            <w:tcW w:type="dxa" w:w="3168"/>
+            <w:tcW w:type="dxa" w:w="4752"/>
           </w:tcPr>
           <w:p>
             <w:r>
-              <w:t>gt_sentiment or star ratings</w:t>
-            </w:r>
-          </w:p>
-        </w:tc>
-        <w:tc>
-          <w:tcPr>
-            <w:tcW w:type="dxa" w:w="3168"/>
-          </w:tcPr>
-          <w:p>
-            <w:r>
-              <w:t>Argmax vs labels; macro = mean of neg/neu/pos recall</w:t>
+              <w:t>none</w:t>
             </w:r>
           </w:p>
         </w:tc>
@@ -1322,31 +1428,21 @@
       <w:tr>
         <w:tc>
           <w:tcPr>
-            <w:tcW w:type="dxa" w:w="3168"/>
+            <w:tcW w:type="dxa" w:w="4752"/>
           </w:tcPr>
           <w:p>
             <w:r>
-              <w:t>Theme recall</w:t>
+              <w:t>0.10 – 0.25</w:t>
             </w:r>
           </w:p>
         </w:tc>
         <w:tc>
           <w:tcPr>
-            <w:tcW w:type="dxa" w:w="3168"/>
+            <w:tcW w:type="dxa" w:w="4752"/>
           </w:tcPr>
           <w:p>
             <w:r>
-              <w:t>gt_theme planted</w:t>
-            </w:r>
-          </w:p>
-        </w:tc>
-        <w:tc>
-          <w:tcPr>
-            <w:tcW w:type="dxa" w:w="3168"/>
-          </w:tcPr>
-          <w:p>
-            <w:r>
-              <w:t>Share of planted themes recovered by clustering</w:t>
+              <w:t>moderate</w:t>
             </w:r>
           </w:p>
         </w:tc>
@@ -1354,31 +1450,82 @@
       <w:tr>
         <w:tc>
           <w:tcPr>
-            <w:tcW w:type="dxa" w:w="3168"/>
+            <w:tcW w:type="dxa" w:w="4752"/>
           </w:tcPr>
           <w:p>
             <w:r>
-              <w:t>Radar recall</w:t>
+              <w:t>&gt;= 0.25</w:t>
             </w:r>
           </w:p>
         </w:tc>
         <w:tc>
           <w:tcPr>
-            <w:tcW w:type="dxa" w:w="3168"/>
+            <w:tcW w:type="dxa" w:w="4752"/>
           </w:tcPr>
           <w:p>
             <w:r>
-              <w:t>gt_theme + planted temporal keys</w:t>
+              <w:t>significant</w:t>
+            </w:r>
+          </w:p>
+        </w:tc>
+      </w:tr>
+    </w:tbl>
+    <w:p>
+      <w:pPr>
+        <w:pStyle w:val="Heading3"/>
+      </w:pPr>
+      <w:r>
+        <w:t>Volume — relative change in reviews per day</w:t>
+      </w:r>
+    </w:p>
+    <w:p>
+      <w:pPr>
+        <w:shd w:fill="F3F4F6" w:val="clear"/>
+      </w:pPr>
+      <w:r>
+        <w:rPr>
+          <w:rFonts w:ascii="Consolas" w:hAnsi="Consolas"/>
+          <w:sz w:val="18"/>
+        </w:rPr>
+        <w:t>r = (#reviews) / (#days)</w:t>
+        <w:br/>
+        <w:t>change = (r_cur - r_ref) / r_ref</w:t>
+      </w:r>
+    </w:p>
+    <w:tbl>
+      <w:tblPr>
+        <w:tblStyle w:val="TableGrid"/>
+        <w:tblW w:type="auto" w:w="0"/>
+        <w:tblLook w:firstColumn="1" w:firstRow="1" w:lastColumn="0" w:lastRow="0" w:noHBand="0" w:noVBand="1" w:val="04A0"/>
+      </w:tblPr>
+      <w:tblGrid>
+        <w:gridCol w:w="4752"/>
+        <w:gridCol w:w="4752"/>
+      </w:tblGrid>
+      <w:tr>
+        <w:tc>
+          <w:tcPr>
+            <w:tcW w:type="dxa" w:w="4752"/>
+          </w:tcPr>
+          <w:p>
+            <w:r>
+              <w:rPr>
+                <w:b/>
+              </w:rPr>
+              <w:t>|change|</w:t>
             </w:r>
           </w:p>
         </w:tc>
         <w:tc>
           <w:tcPr>
-            <w:tcW w:type="dxa" w:w="3168"/>
+            <w:tcW w:type="dxa" w:w="4752"/>
           </w:tcPr>
           <w:p>
             <w:r>
-              <w:t>Expected NEW/EMERGING/DECLINING/… patterns</w:t>
+              <w:rPr>
+                <w:b/>
+              </w:rPr>
+              <w:t>Status</w:t>
             </w:r>
           </w:p>
         </w:tc>
@@ -1386,31 +1533,21 @@
       <w:tr>
         <w:tc>
           <w:tcPr>
-            <w:tcW w:type="dxa" w:w="3168"/>
+            <w:tcW w:type="dxa" w:w="4752"/>
           </w:tcPr>
           <w:p>
             <w:r>
-              <w:t>PII recall</w:t>
+              <w:t>&lt; 20%</w:t>
             </w:r>
           </w:p>
         </w:tc>
         <w:tc>
           <w:tcPr>
-            <w:tcW w:type="dxa" w:w="3168"/>
+            <w:tcW w:type="dxa" w:w="4752"/>
           </w:tcPr>
           <w:p>
             <w:r>
-              <w:t>gt_pii planted</w:t>
-            </w:r>
-          </w:p>
-        </w:tc>
-        <w:tc>
-          <w:tcPr>
-            <w:tcW w:type="dxa" w:w="3168"/>
-          </w:tcPr>
-          <w:p>
-            <w:r>
-              <w:t>Planted rows that received ≥1 redaction</w:t>
+              <w:t>none</w:t>
             </w:r>
           </w:p>
         </w:tc>
@@ -1418,36 +1555,264 @@
       <w:tr>
         <w:tc>
           <w:tcPr>
-            <w:tcW w:type="dxa" w:w="3168"/>
+            <w:tcW w:type="dxa" w:w="4752"/>
           </w:tcPr>
           <w:p>
             <w:r>
-              <w:t>Mean available recalls</w:t>
+              <w:t>20% – 50%</w:t>
             </w:r>
           </w:p>
         </w:tc>
         <w:tc>
           <w:tcPr>
-            <w:tcW w:type="dxa" w:w="3168"/>
+            <w:tcW w:type="dxa" w:w="4752"/>
           </w:tcPr>
           <w:p>
             <w:r>
-              <w:t>any of the above</w:t>
+              <w:t>moderate</w:t>
+            </w:r>
+          </w:p>
+        </w:tc>
+      </w:tr>
+      <w:tr>
+        <w:tc>
+          <w:tcPr>
+            <w:tcW w:type="dxa" w:w="4752"/>
+          </w:tcPr>
+          <w:p>
+            <w:r>
+              <w:t>&gt;= 50%</w:t>
             </w:r>
           </w:p>
         </w:tc>
         <w:tc>
           <w:tcPr>
-            <w:tcW w:type="dxa" w:w="3168"/>
+            <w:tcW w:type="dxa" w:w="4752"/>
           </w:tcPr>
           <w:p>
             <w:r>
-              <w:t>Average of scores this batch can compute</w:t>
+              <w:t>significant</w:t>
             </w:r>
           </w:p>
         </w:tc>
       </w:tr>
     </w:tbl>
+    <w:p>
+      <w:pPr>
+        <w:pStyle w:val="Heading3"/>
+      </w:pPr>
+      <w:r>
+        <w:t>Review length — Kolmogorov–Smirnov (KS)</w:t>
+      </w:r>
+    </w:p>
+    <w:p>
+      <w:r>
+        <w:t>Two-sample KS test on character lengths of text_redacted. Uses statistic D and p-value (scipy.stats.ks_2samp). Status:</w:t>
+      </w:r>
+    </w:p>
+    <w:p>
+      <w:pPr>
+        <w:pStyle w:val="ListBullet"/>
+      </w:pPr>
+      <w:r>
+        <w:t>none — if p &gt;= 0.01, or D &lt; 0.10</w:t>
+      </w:r>
+    </w:p>
+    <w:p>
+      <w:pPr>
+        <w:pStyle w:val="ListBullet"/>
+      </w:pPr>
+      <w:r>
+        <w:t>moderate — if p &lt; 0.01 and 0.10 &lt;= D &lt; 0.20</w:t>
+      </w:r>
+    </w:p>
+    <w:p>
+      <w:pPr>
+        <w:pStyle w:val="ListBullet"/>
+      </w:pPr>
+      <w:r>
+        <w:t>significant — if p &lt; 0.01 and D &gt;= 0.20</w:t>
+      </w:r>
+    </w:p>
+    <w:p>
+      <w:pPr>
+        <w:pStyle w:val="ListBullet"/>
+      </w:pPr>
+      <w:r>
+        <w:t>insufficient_data — fewer than 2 lengths in either window</w:t>
+      </w:r>
+    </w:p>
+    <w:p>
+      <w:r>
+        <w:t>Default thresholds (DriftThresholds): psi_moderate=0.10, psi_significant=0.25, volume_moderate=0.20, volume_significant=0.50, ks_moderate=0.10, ks_significant=0.20, ks_alpha=0.01.</w:t>
+      </w:r>
+    </w:p>
+    <w:p>
+      <w:pPr>
+        <w:pStyle w:val="Heading2"/>
+      </w:pPr>
+      <w:r>
+        <w:t>4.5 Sentiment scoring formulas (ml/sentiment/model.py, ml/evaluation/metrics.py)</w:t>
+      </w:r>
+    </w:p>
+    <w:p>
+      <w:r>
+        <w:t>Inference (product path): 3-class RoBERTa logits → softmax probabilities over {negative, neutral, positive}.</w:t>
+      </w:r>
+    </w:p>
+    <w:p>
+      <w:pPr>
+        <w:shd w:fill="F3F4F6" w:val="clear"/>
+      </w:pPr>
+      <w:r>
+        <w:rPr>
+          <w:rFonts w:ascii="Consolas" w:hAnsi="Consolas"/>
+          <w:sz w:val="18"/>
+        </w:rPr>
+        <w:t>p_c = softmax(logits)_c</w:t>
+        <w:br/>
+        <w:t>label = argmax_c p_c</w:t>
+        <w:br/>
+        <w:t>confidence = max_c p_c</w:t>
+      </w:r>
+    </w:p>
+    <w:p>
+      <w:r>
+        <w:t>Held-out / labelled evaluation (Model Validation uses Amazon TEST):</w:t>
+      </w:r>
+    </w:p>
+    <w:p>
+      <w:pPr>
+        <w:shd w:fill="F3F4F6" w:val="clear"/>
+      </w:pPr>
+      <w:r>
+        <w:rPr>
+          <w:rFonts w:ascii="Consolas" w:hAnsi="Consolas"/>
+          <w:sz w:val="18"/>
+        </w:rPr>
+        <w:t>precision_c = TP_c / (TP_c + FP_c)</w:t>
+        <w:br/>
+        <w:t>recall_c    = TP_c / (TP_c + FN_c)</w:t>
+        <w:br/>
+        <w:t>F1_c        = 2 * precision_c * recall_c / (precision_c + recall_c)</w:t>
+        <w:br/>
+        <w:t>accuracy    = (# correct labels) / N</w:t>
+        <w:br/>
+        <w:t>macro_recall = (recall_neg + recall_neu + recall_pos) / 3</w:t>
+        <w:br/>
+        <w:t>macro_f1     = (F1_neg + F1_neu + F1_pos) / 3</w:t>
+      </w:r>
+    </w:p>
+    <w:p>
+      <w:r>
+        <w:t>Amazon fine-tune class weights (inverse frequency, then optional boosts):</w:t>
+      </w:r>
+    </w:p>
+    <w:p>
+      <w:pPr>
+        <w:shd w:fill="F3F4F6" w:val="clear"/>
+      </w:pPr>
+      <w:r>
+        <w:rPr>
+          <w:rFonts w:ascii="Consolas" w:hAnsi="Consolas"/>
+          <w:sz w:val="18"/>
+        </w:rPr>
+        <w:t>w_c = (N / (3 * count_c)) ** weight_power</w:t>
+        <w:br/>
+        <w:t>w_neu *= neu_boost;  w_neg *= neg_boost</w:t>
+        <w:br/>
+        <w:t>w = w / mean(w)     # keep mean ~1 for stable LR</w:t>
+      </w:r>
+    </w:p>
+    <w:p>
+      <w:r>
+        <w:t>Selected production train uses weight_power=1, neu_boost=1, neg_boost=1 (plain inverse-frequency CE).</w:t>
+      </w:r>
+    </w:p>
+    <w:p>
+      <w:pPr>
+        <w:pStyle w:val="Heading2"/>
+      </w:pPr>
+      <w:r>
+        <w:t>4.6 Theme formulas (ml/themes/discovery.py)</w:t>
+      </w:r>
+    </w:p>
+    <w:p>
+      <w:pPr>
+        <w:pStyle w:val="ListBullet"/>
+      </w:pPr>
+      <w:r>
+        <w:t>Embeddings: MiniLM 384-d L2-normalised vectors.</w:t>
+      </w:r>
+    </w:p>
+    <w:p>
+      <w:pPr>
+        <w:pStyle w:val="ListBullet"/>
+      </w:pPr>
+      <w:r>
+        <w:t>Clustering: PCA → HDBSCAN micro-clusters → average-linkage merge of centroids when cosine similarity ≥ merge_threshold.</w:t>
+      </w:r>
+    </w:p>
+    <w:p>
+      <w:pPr>
+        <w:pStyle w:val="ListBullet"/>
+      </w:pPr>
+      <w:r>
+        <w:t>Assignment: cluster member, or nearest_centroid if cosine similarity high enough, else unassigned.</w:t>
+      </w:r>
+    </w:p>
+    <w:p>
+      <w:pPr>
+        <w:shd w:fill="F3F4F6" w:val="clear"/>
+      </w:pPr>
+      <w:r>
+        <w:rPr>
+          <w:rFonts w:ascii="Consolas" w:hAnsi="Consolas"/>
+          <w:sz w:val="18"/>
+        </w:rPr>
+        <w:t>centroid_k = normalize(mean(embeddings of members_k))</w:t>
+        <w:br/>
+        <w:t>similarity(review, theme) = cosine(embedding, centroid) = embedding · centroid</w:t>
+        <w:br/>
+        <w:t>coherence(theme) = mean(cosine(member_i, centroid)) over members</w:t>
+      </w:r>
+    </w:p>
+    <w:p>
+      <w:r>
+        <w:t>Theme negative_pct on the dashboard = 100 * negative_count / size.</w:t>
+      </w:r>
+    </w:p>
+    <w:p>
+      <w:pPr>
+        <w:pStyle w:val="Heading2"/>
+      </w:pPr>
+      <w:r>
+        <w:t>4.7 Evaluation bundle formulas (batch_eval / global Model Validation)</w:t>
+      </w:r>
+    </w:p>
+    <w:p>
+      <w:r>
+        <w:t>Product accuracy page uses global Amazon holdout metrics (artifacts/reports/amazon_sentiment_eval.json). Optional per-batch planted/star scores may still be computed offline but are not the product accuracy UI.</w:t>
+      </w:r>
+    </w:p>
+    <w:p>
+      <w:pPr>
+        <w:shd w:fill="F3F4F6" w:val="clear"/>
+      </w:pPr>
+      <w:r>
+        <w:rPr>
+          <w:rFonts w:ascii="Consolas" w:hAnsi="Consolas"/>
+          <w:sz w:val="18"/>
+        </w:rPr>
+        <w:t>theme_recall   = (# planted themes recovered) / (# planted themes)</w:t>
+        <w:br/>
+        <w:t>radar_recall   = (# expected radar patterns matched) / (# expected patterns)</w:t>
+        <w:br/>
+        <w:t>pii_recall     = (# planted-PII rows with ≥1 redaction) / (# planted-PII rows)</w:t>
+        <w:br/>
+        <w:t>mean_available = mean of whichever of {sentiment_macro_recall, theme_recall, radar_recall, pii_recall} exist</w:t>
+      </w:r>
+    </w:p>
     <w:p>
       <w:pPr>
         <w:pStyle w:val="Heading1"/>

</xml_diff>